<commit_message>
march 7th third version
</commit_message>
<xml_diff>
--- a/Report.docx
+++ b/Report.docx
@@ -55,7 +55,21 @@
           <w:sz w:val="28"/>
           <w:szCs w:val="28"/>
         </w:rPr>
-        <w:t xml:space="preserve">This website includes two topics of technology, legislation and a page for presenting the statistics about the canada’s Internet in charts. Technology and legislation topics are gathered by research and the collected data is saved in the form of the JSON files. Statistics will be collected by </w:t>
+        <w:t xml:space="preserve">This website includes two topics of technology, legislation and a page for presenting the statistics about the canada’s Internet in charts. Technology and legislation topics are gathered by </w:t>
+      </w:r>
+      <w:r>
+        <w:rPr>
+          <w:sz w:val="28"/>
+          <w:szCs w:val="28"/>
+        </w:rPr>
+        <w:t>research,</w:t>
+      </w:r>
+      <w:r>
+        <w:rPr>
+          <w:sz w:val="28"/>
+          <w:szCs w:val="28"/>
+        </w:rPr>
+        <w:t xml:space="preserve"> and the collected data is saved in the form of the JSON files. Statistics will be collected by </w:t>
       </w:r>
       <w:r>
         <w:rPr>
@@ -83,14 +97,102 @@
           <w:sz w:val="28"/>
           <w:szCs w:val="28"/>
         </w:rPr>
-        <w:t xml:space="preserve"> from the Statcan, at the moment of starting the server. The last uptodate data will be extracted from the Statcan </w:t>
-      </w:r>
-      <w:r>
-        <w:rPr>
-          <w:sz w:val="28"/>
-          <w:szCs w:val="28"/>
-        </w:rPr>
-        <w:t xml:space="preserve">API and load data in the memory to be ready to provide to clients. It also caches the fetched data in the local storage of backend. In case Statcan was not avalilable at the moment of starting or rebooting the server, it will upload the last cached data for clients. The front-end will have access to the technology, legislation and statistics data via the provided REST API. Front-end of the website  provides a form for users to contribute content to the site. The form will contact the server by provided REST API to upload data including the possibe pictures.    </w:t>
+        <w:t xml:space="preserve"> from the Statcan, </w:t>
+      </w:r>
+      <w:proofErr w:type="gramStart"/>
+      <w:r>
+        <w:rPr>
+          <w:sz w:val="28"/>
+          <w:szCs w:val="28"/>
+        </w:rPr>
+        <w:t>at the moment</w:t>
+      </w:r>
+      <w:proofErr w:type="gramEnd"/>
+      <w:r>
+        <w:rPr>
+          <w:sz w:val="28"/>
+          <w:szCs w:val="28"/>
+        </w:rPr>
+        <w:t xml:space="preserve"> of starting the server. The last </w:t>
+      </w:r>
+      <w:r>
+        <w:rPr>
+          <w:sz w:val="28"/>
+          <w:szCs w:val="28"/>
+        </w:rPr>
+        <w:t>UpToDate</w:t>
+      </w:r>
+      <w:r>
+        <w:rPr>
+          <w:sz w:val="28"/>
+          <w:szCs w:val="28"/>
+        </w:rPr>
+        <w:t xml:space="preserve"> data will be extracted from the Statcan </w:t>
+      </w:r>
+      <w:r>
+        <w:rPr>
+          <w:sz w:val="28"/>
+          <w:szCs w:val="28"/>
+        </w:rPr>
+        <w:t xml:space="preserve">API and load data in the memory to be ready to provide to clients. It also caches the fetched data in the local storage of backend. In case Statcan was not </w:t>
+      </w:r>
+      <w:r>
+        <w:rPr>
+          <w:sz w:val="28"/>
+          <w:szCs w:val="28"/>
+        </w:rPr>
+        <w:t>available</w:t>
+      </w:r>
+      <w:r>
+        <w:rPr>
+          <w:sz w:val="28"/>
+          <w:szCs w:val="28"/>
+        </w:rPr>
+        <w:t xml:space="preserve"> </w:t>
+      </w:r>
+      <w:proofErr w:type="gramStart"/>
+      <w:r>
+        <w:rPr>
+          <w:sz w:val="28"/>
+          <w:szCs w:val="28"/>
+        </w:rPr>
+        <w:t>at the moment</w:t>
+      </w:r>
+      <w:proofErr w:type="gramEnd"/>
+      <w:r>
+        <w:rPr>
+          <w:sz w:val="28"/>
+          <w:szCs w:val="28"/>
+        </w:rPr>
+        <w:t xml:space="preserve"> of starting or rebooting the server, it will upload the last cached data for clients. The front-end will have access to the technology, legislation and statistics data via the provided REST API. Front-end of the </w:t>
+      </w:r>
+      <w:r>
+        <w:rPr>
+          <w:sz w:val="28"/>
+          <w:szCs w:val="28"/>
+        </w:rPr>
+        <w:t>website provides</w:t>
+      </w:r>
+      <w:r>
+        <w:rPr>
+          <w:sz w:val="28"/>
+          <w:szCs w:val="28"/>
+        </w:rPr>
+        <w:t xml:space="preserve"> a form for users to contribute content to the site. The form will contact the server by provided REST API to upload data including the </w:t>
+      </w:r>
+      <w:r>
+        <w:rPr>
+          <w:sz w:val="28"/>
+          <w:szCs w:val="28"/>
+        </w:rPr>
+        <w:t>possible</w:t>
+      </w:r>
+      <w:r>
+        <w:rPr>
+          <w:sz w:val="28"/>
+          <w:szCs w:val="28"/>
+        </w:rPr>
+        <w:t xml:space="preserve"> pictures.    </w:t>
       </w:r>
     </w:p>
     <w:p>
@@ -182,7 +284,14 @@
           <w:sz w:val="28"/>
           <w:szCs w:val="28"/>
         </w:rPr>
-        <w:t>: 16hrs</w:t>
+        <w:t xml:space="preserve">: </w:t>
+      </w:r>
+      <w:r>
+        <w:rPr>
+          <w:sz w:val="28"/>
+          <w:szCs w:val="28"/>
+        </w:rPr>
+        <w:t>16 hours</w:t>
       </w:r>
       <w:r>
         <w:rPr>
@@ -231,7 +340,14 @@
           <w:sz w:val="28"/>
           <w:szCs w:val="28"/>
         </w:rPr>
-        <w:t>6hrs)</w:t>
+        <w:t>hrs.</w:t>
+      </w:r>
+      <w:r>
+        <w:rPr>
+          <w:sz w:val="28"/>
+          <w:szCs w:val="28"/>
+        </w:rPr>
+        <w:t>)</w:t>
       </w:r>
     </w:p>
     <w:p>
@@ -252,7 +368,21 @@
           <w:sz w:val="28"/>
           <w:szCs w:val="28"/>
         </w:rPr>
-        <w:t>Backend and designt REST API (</w:t>
+        <w:t xml:space="preserve">Backend and </w:t>
+      </w:r>
+      <w:r>
+        <w:rPr>
+          <w:sz w:val="28"/>
+          <w:szCs w:val="28"/>
+        </w:rPr>
+        <w:t>design</w:t>
+      </w:r>
+      <w:r>
+        <w:rPr>
+          <w:sz w:val="28"/>
+          <w:szCs w:val="28"/>
+        </w:rPr>
+        <w:t xml:space="preserve"> REST API (</w:t>
       </w:r>
       <w:r>
         <w:rPr>
@@ -273,7 +403,28 @@
           <w:sz w:val="28"/>
           <w:szCs w:val="28"/>
         </w:rPr>
-        <w:t>40hrs)</w:t>
+        <w:t>40</w:t>
+      </w:r>
+      <w:r>
+        <w:rPr>
+          <w:sz w:val="28"/>
+          <w:szCs w:val="28"/>
+        </w:rPr>
+        <w:t xml:space="preserve"> </w:t>
+      </w:r>
+      <w:r>
+        <w:rPr>
+          <w:sz w:val="28"/>
+          <w:szCs w:val="28"/>
+        </w:rPr>
+        <w:t>hours</w:t>
+      </w:r>
+      <w:r>
+        <w:rPr>
+          <w:sz w:val="28"/>
+          <w:szCs w:val="28"/>
+        </w:rPr>
+        <w:t>)</w:t>
       </w:r>
     </w:p>
     <w:p>
@@ -343,7 +494,28 @@
           <w:sz w:val="28"/>
           <w:szCs w:val="28"/>
         </w:rPr>
-        <w:t>40hrs)</w:t>
+        <w:t>40</w:t>
+      </w:r>
+      <w:r>
+        <w:rPr>
+          <w:sz w:val="28"/>
+          <w:szCs w:val="28"/>
+        </w:rPr>
+        <w:t xml:space="preserve"> </w:t>
+      </w:r>
+      <w:r>
+        <w:rPr>
+          <w:sz w:val="28"/>
+          <w:szCs w:val="28"/>
+        </w:rPr>
+        <w:t>hours</w:t>
+      </w:r>
+      <w:r>
+        <w:rPr>
+          <w:sz w:val="28"/>
+          <w:szCs w:val="28"/>
+        </w:rPr>
+        <w:t>)</w:t>
       </w:r>
     </w:p>
     <w:p>
@@ -385,7 +557,28 @@
           <w:sz w:val="28"/>
           <w:szCs w:val="28"/>
         </w:rPr>
-        <w:t>40hrs)</w:t>
+        <w:t>40</w:t>
+      </w:r>
+      <w:r>
+        <w:rPr>
+          <w:sz w:val="28"/>
+          <w:szCs w:val="28"/>
+        </w:rPr>
+        <w:t xml:space="preserve"> </w:t>
+      </w:r>
+      <w:r>
+        <w:rPr>
+          <w:sz w:val="28"/>
+          <w:szCs w:val="28"/>
+        </w:rPr>
+        <w:t>hours</w:t>
+      </w:r>
+      <w:r>
+        <w:rPr>
+          <w:sz w:val="28"/>
+          <w:szCs w:val="28"/>
+        </w:rPr>
+        <w:t>)</w:t>
       </w:r>
     </w:p>
     <w:p>
@@ -455,7 +648,21 @@
           <w:sz w:val="28"/>
           <w:szCs w:val="28"/>
         </w:rPr>
-        <w:t>hrs)</w:t>
+        <w:t xml:space="preserve"> </w:t>
+      </w:r>
+      <w:r>
+        <w:rPr>
+          <w:sz w:val="28"/>
+          <w:szCs w:val="28"/>
+        </w:rPr>
+        <w:t>hours</w:t>
+      </w:r>
+      <w:r>
+        <w:rPr>
+          <w:sz w:val="28"/>
+          <w:szCs w:val="28"/>
+        </w:rPr>
+        <w:t>)</w:t>
       </w:r>
     </w:p>
     <w:p>
@@ -511,7 +718,58 @@
           <w:sz w:val="28"/>
           <w:szCs w:val="28"/>
         </w:rPr>
-        <w:t>1hrs)</w:t>
+        <w:t>1</w:t>
+      </w:r>
+      <w:r>
+        <w:rPr>
+          <w:sz w:val="28"/>
+          <w:szCs w:val="28"/>
+        </w:rPr>
+        <w:t xml:space="preserve"> hour</w:t>
+      </w:r>
+      <w:r>
+        <w:rPr>
+          <w:sz w:val="28"/>
+          <w:szCs w:val="28"/>
+        </w:rPr>
+        <w:t>)</w:t>
+      </w:r>
+    </w:p>
+    <w:p>
+      <w:pPr>
+        <w:pStyle w:val="ListParagraph"/>
+        <w:numPr>
+          <w:ilvl w:val="0"/>
+          <w:numId w:val="2"/>
+        </w:numPr>
+        <w:jc w:val="both"/>
+        <w:rPr>
+          <w:sz w:val="28"/>
+          <w:szCs w:val="28"/>
+        </w:rPr>
+      </w:pPr>
+      <w:r>
+        <w:rPr>
+          <w:sz w:val="28"/>
+          <w:szCs w:val="28"/>
+        </w:rPr>
+        <w:t xml:space="preserve">HTML validation and accessibility </w:t>
+      </w:r>
+      <w:proofErr w:type="gramStart"/>
+      <w:r>
+        <w:rPr>
+          <w:sz w:val="28"/>
+          <w:szCs w:val="28"/>
+        </w:rPr>
+        <w:t>check( Duration</w:t>
+      </w:r>
+      <w:proofErr w:type="gramEnd"/>
+      <w:r>
+        <w:rPr>
+          <w:sz w:val="28"/>
+          <w:szCs w:val="28"/>
+        </w:rPr>
+        <w:t xml:space="preserve"> 2 hours)</w:t>
       </w:r>
     </w:p>
     <w:p>
@@ -582,7 +840,57 @@
           <w:sz w:val="28"/>
           <w:szCs w:val="28"/>
         </w:rPr>
-        <w:t xml:space="preserve">I laso looked for the statistics and founf Statcan a good source which also provides APIs for web developers.  I extended the duration for thid task so I could study the Statcan APIs and the structure of data from these APIs. </w:t>
+        <w:t xml:space="preserve">I </w:t>
+      </w:r>
+      <w:r>
+        <w:rPr>
+          <w:sz w:val="28"/>
+          <w:szCs w:val="28"/>
+        </w:rPr>
+        <w:t>also</w:t>
+      </w:r>
+      <w:r>
+        <w:rPr>
+          <w:sz w:val="28"/>
+          <w:szCs w:val="28"/>
+        </w:rPr>
+        <w:t xml:space="preserve"> looked for the statistics and </w:t>
+      </w:r>
+      <w:r>
+        <w:rPr>
+          <w:sz w:val="28"/>
+          <w:szCs w:val="28"/>
+        </w:rPr>
+        <w:t>found</w:t>
+      </w:r>
+      <w:r>
+        <w:rPr>
+          <w:sz w:val="28"/>
+          <w:szCs w:val="28"/>
+        </w:rPr>
+        <w:t xml:space="preserve"> Statcan a good source which also provides APIs for web </w:t>
+      </w:r>
+      <w:r>
+        <w:rPr>
+          <w:sz w:val="28"/>
+          <w:szCs w:val="28"/>
+        </w:rPr>
+        <w:lastRenderedPageBreak/>
+        <w:t xml:space="preserve">developers.  I extended the duration for </w:t>
+      </w:r>
+      <w:r>
+        <w:rPr>
+          <w:sz w:val="28"/>
+          <w:szCs w:val="28"/>
+        </w:rPr>
+        <w:t>this</w:t>
+      </w:r>
+      <w:r>
+        <w:rPr>
+          <w:sz w:val="28"/>
+          <w:szCs w:val="28"/>
+        </w:rPr>
+        <w:t xml:space="preserve"> task so I could study the Statcan APIs and the structure of data from these APIs. </w:t>
       </w:r>
     </w:p>
     <w:p>
@@ -598,8 +906,21 @@
           <w:sz w:val="28"/>
           <w:szCs w:val="28"/>
         </w:rPr>
-        <w:lastRenderedPageBreak/>
-        <w:t>Each table in Statcan is caled cube</w:t>
+        <w:t>Each table in Statcan is cal</w:t>
+      </w:r>
+      <w:r>
+        <w:rPr>
+          <w:sz w:val="28"/>
+          <w:szCs w:val="28"/>
+        </w:rPr>
+        <w:t>l</w:t>
+      </w:r>
+      <w:r>
+        <w:rPr>
+          <w:sz w:val="28"/>
+          <w:szCs w:val="28"/>
+        </w:rPr>
+        <w:t>ed cube</w:t>
       </w:r>
       <w:r>
         <w:rPr>
@@ -724,6 +1045,7 @@
       </w:pPr>
       <w:r>
         <w:rPr>
+          <w:noProof/>
           <w:sz w:val="28"/>
           <w:szCs w:val="28"/>
         </w:rPr>
@@ -797,14 +1119,42 @@
           <w:sz w:val="28"/>
           <w:szCs w:val="28"/>
         </w:rPr>
-        <w:t xml:space="preserve">I this task, I designed a server as a proxy for Statcan. At early stage of the design, the server would receive request from the client and send the according API request to Statcan and then send the received data to the client. In the testing stage of this task, and when I started to design template engins and layouts, I noticed that it causes big delay. In addition, sometimes Statcan is unavailable, and it makes </w:t>
-      </w:r>
-      <w:r>
-        <w:rPr>
-          <w:sz w:val="28"/>
-          <w:szCs w:val="28"/>
-        </w:rPr>
-        <w:t xml:space="preserve">my web site unoperational too. </w:t>
+        <w:t xml:space="preserve">I this task, I designed a server as a proxy for Statcan. At early stage of the design, the server would receive request from the client and send the according API request to Statcan and then send the received data to the client. In the testing stage of this task, and when I started to design template </w:t>
+      </w:r>
+      <w:r>
+        <w:rPr>
+          <w:sz w:val="28"/>
+          <w:szCs w:val="28"/>
+        </w:rPr>
+        <w:t>engines</w:t>
+      </w:r>
+      <w:r>
+        <w:rPr>
+          <w:sz w:val="28"/>
+          <w:szCs w:val="28"/>
+        </w:rPr>
+        <w:t xml:space="preserve"> and layouts, I noticed that it causes big delay. In addition, sometimes Statcan is unavailable, and it makes </w:t>
+      </w:r>
+      <w:r>
+        <w:rPr>
+          <w:sz w:val="28"/>
+          <w:szCs w:val="28"/>
+        </w:rPr>
+        <w:t>my web site un</w:t>
+      </w:r>
+      <w:r>
+        <w:rPr>
+          <w:sz w:val="28"/>
+          <w:szCs w:val="28"/>
+        </w:rPr>
+        <w:t xml:space="preserve"> </w:t>
+      </w:r>
+      <w:r>
+        <w:rPr>
+          <w:sz w:val="28"/>
+          <w:szCs w:val="28"/>
+        </w:rPr>
+        <w:t xml:space="preserve">operational too. </w:t>
       </w:r>
     </w:p>
     <w:p>
@@ -820,7 +1170,83 @@
           <w:sz w:val="28"/>
           <w:szCs w:val="28"/>
         </w:rPr>
-        <w:t xml:space="preserve">To mitigate this issue, I redisigned the backend so the server fetches all the required data from Statcan at the moment of start or reboot and before being available to clients. This approach elliminate the delays for fetching data from Statcan each time a client is navigating in the statistics page. It also makes sure that the latest fetched data from Statcan is available if the Statcan is not available. It can prevent potential issus in depolying the site, especially for testing and assessment. </w:t>
+        <w:t xml:space="preserve">To mitigate this issue, I </w:t>
+      </w:r>
+      <w:r>
+        <w:rPr>
+          <w:sz w:val="28"/>
+          <w:szCs w:val="28"/>
+        </w:rPr>
+        <w:t>redesigned</w:t>
+      </w:r>
+      <w:r>
+        <w:rPr>
+          <w:sz w:val="28"/>
+          <w:szCs w:val="28"/>
+        </w:rPr>
+        <w:t xml:space="preserve"> the </w:t>
+      </w:r>
+      <w:proofErr w:type="gramStart"/>
+      <w:r>
+        <w:rPr>
+          <w:sz w:val="28"/>
+          <w:szCs w:val="28"/>
+        </w:rPr>
+        <w:t>backend</w:t>
+      </w:r>
+      <w:proofErr w:type="gramEnd"/>
+      <w:r>
+        <w:rPr>
+          <w:sz w:val="28"/>
+          <w:szCs w:val="28"/>
+        </w:rPr>
+        <w:t xml:space="preserve"> so the server fetches all the required data from Statcan </w:t>
+      </w:r>
+      <w:proofErr w:type="gramStart"/>
+      <w:r>
+        <w:rPr>
+          <w:sz w:val="28"/>
+          <w:szCs w:val="28"/>
+        </w:rPr>
+        <w:t>at the moment</w:t>
+      </w:r>
+      <w:proofErr w:type="gramEnd"/>
+      <w:r>
+        <w:rPr>
+          <w:sz w:val="28"/>
+          <w:szCs w:val="28"/>
+        </w:rPr>
+        <w:t xml:space="preserve"> of start or reboot and before being available to clients. This approach </w:t>
+      </w:r>
+      <w:proofErr w:type="gramStart"/>
+      <w:r>
+        <w:rPr>
+          <w:sz w:val="28"/>
+          <w:szCs w:val="28"/>
+        </w:rPr>
+        <w:t>eliminate</w:t>
+      </w:r>
+      <w:proofErr w:type="gramEnd"/>
+      <w:r>
+        <w:rPr>
+          <w:sz w:val="28"/>
+          <w:szCs w:val="28"/>
+        </w:rPr>
+        <w:t xml:space="preserve"> the delays for fetching data from Statcan each time a client is navigating in the statistics page. It also makes sure that the latest fetched data from Statcan is available if the Statcan is not available. It can prevent potential </w:t>
+      </w:r>
+      <w:r>
+        <w:rPr>
+          <w:sz w:val="28"/>
+          <w:szCs w:val="28"/>
+        </w:rPr>
+        <w:t>issues</w:t>
+      </w:r>
+      <w:r>
+        <w:rPr>
+          <w:sz w:val="28"/>
+          <w:szCs w:val="28"/>
+        </w:rPr>
+        <w:t xml:space="preserve"> in depolying the site, especially for testing and assessment. </w:t>
       </w:r>
     </w:p>
     <w:p>
@@ -836,15 +1262,66 @@
           <w:sz w:val="28"/>
           <w:szCs w:val="28"/>
         </w:rPr>
-        <w:t xml:space="preserve">To speed up the process of fetching data from the Statcan, I applied Promise.all(), so it helps to send several requests to the Statcan at the same time instead of using await and hold everyting until each request is answered. </w:t>
-      </w:r>
-      <w:r>
-        <w:rPr>
-          <w:sz w:val="28"/>
-          <w:szCs w:val="28"/>
-        </w:rPr>
         <w:lastRenderedPageBreak/>
-        <w:t>However, I noticed that sometimes Statcan gets overwelmed and send back a response with status 429, which is an indication of toomany requests [2].</w:t>
+        <w:t xml:space="preserve">To speed up the process of fetching data from the Statcan, I applied </w:t>
+      </w:r>
+      <w:proofErr w:type="gramStart"/>
+      <w:r>
+        <w:rPr>
+          <w:sz w:val="28"/>
+          <w:szCs w:val="28"/>
+        </w:rPr>
+        <w:t>Promise.all(</w:t>
+      </w:r>
+      <w:proofErr w:type="gramEnd"/>
+      <w:r>
+        <w:rPr>
+          <w:sz w:val="28"/>
+          <w:szCs w:val="28"/>
+        </w:rPr>
+        <w:t xml:space="preserve">), so it helps to send several requests to the Statcan at the same time instead of using await and hold </w:t>
+      </w:r>
+      <w:r>
+        <w:rPr>
+          <w:sz w:val="28"/>
+          <w:szCs w:val="28"/>
+        </w:rPr>
+        <w:t>everything</w:t>
+      </w:r>
+      <w:r>
+        <w:rPr>
+          <w:sz w:val="28"/>
+          <w:szCs w:val="28"/>
+        </w:rPr>
+        <w:t xml:space="preserve"> until each request is answered. However, I noticed that sometimes Statcan gets </w:t>
+      </w:r>
+      <w:r>
+        <w:rPr>
+          <w:sz w:val="28"/>
+          <w:szCs w:val="28"/>
+        </w:rPr>
+        <w:t>overwhelmed</w:t>
+      </w:r>
+      <w:r>
+        <w:rPr>
+          <w:sz w:val="28"/>
+          <w:szCs w:val="28"/>
+        </w:rPr>
+        <w:t xml:space="preserve"> and send back a response with status 429, which is an indication of </w:t>
+      </w:r>
+      <w:r>
+        <w:rPr>
+          <w:sz w:val="28"/>
+          <w:szCs w:val="28"/>
+        </w:rPr>
+        <w:t>too many</w:t>
+      </w:r>
+      <w:r>
+        <w:rPr>
+          <w:sz w:val="28"/>
+          <w:szCs w:val="28"/>
+        </w:rPr>
+        <w:t xml:space="preserve"> requests [2].</w:t>
       </w:r>
       <w:r>
         <w:rPr>
@@ -880,6 +1357,57 @@
           <w:szCs w:val="28"/>
         </w:rPr>
         <w:t xml:space="preserve"> so to send failed request again after 5 seconds. </w:t>
+      </w:r>
+    </w:p>
+    <w:p>
+      <w:pPr>
+        <w:jc w:val="both"/>
+        <w:rPr>
+          <w:sz w:val="28"/>
+          <w:szCs w:val="28"/>
+        </w:rPr>
+      </w:pPr>
+      <w:r>
+        <w:rPr>
+          <w:sz w:val="28"/>
+          <w:szCs w:val="28"/>
+        </w:rPr>
+        <w:t xml:space="preserve">Another </w:t>
+      </w:r>
+      <w:r>
+        <w:rPr>
+          <w:sz w:val="28"/>
+          <w:szCs w:val="28"/>
+        </w:rPr>
+        <w:t>feature</w:t>
+      </w:r>
+      <w:r>
+        <w:rPr>
+          <w:sz w:val="28"/>
+          <w:szCs w:val="28"/>
+        </w:rPr>
+        <w:t xml:space="preserve"> in the server is the REST API for posting the content contributions to the server. The body of the request for this end point is JSON type</w:t>
+      </w:r>
+      <w:r>
+        <w:rPr>
+          <w:sz w:val="28"/>
+          <w:szCs w:val="28"/>
+        </w:rPr>
+        <w:t>, and it has a property that itself is an object and contains images in the format of base64. When data receives by this end point, the images will be converted to the binary and saved in the local storage</w:t>
+      </w:r>
+      <w:r>
+        <w:rPr>
+          <w:sz w:val="28"/>
+          <w:szCs w:val="28"/>
+        </w:rPr>
+        <w:t xml:space="preserve"> [9]</w:t>
+      </w:r>
+      <w:r>
+        <w:rPr>
+          <w:sz w:val="28"/>
+          <w:szCs w:val="28"/>
+        </w:rPr>
+        <w:t xml:space="preserve">. The images get deleted from data and instead their addresses in the local storage will be recorded in the data.  After this the JSON will be cleaned of unnecessary properties if they are empty and added to the corresponding JSON file in the database. </w:t>
       </w:r>
     </w:p>
     <w:p>
@@ -929,21 +1457,116 @@
           <w:sz w:val="28"/>
           <w:szCs w:val="28"/>
         </w:rPr>
-        <w:t xml:space="preserve">the main javaScript code is in app.js. It will create instances of multiple made classes that are designed for fetching data from the server, renderning  HTMLs and creating charts. It starts with fetching data </w:t>
-      </w:r>
-      <w:r>
-        <w:rPr>
-          <w:sz w:val="28"/>
-          <w:szCs w:val="28"/>
-        </w:rPr>
-        <w:t xml:space="preserve"> from the srever, initializing template engine instances and rendering htmls for each page, </w:t>
-      </w:r>
-      <w:r>
-        <w:rPr>
-          <w:sz w:val="28"/>
-          <w:szCs w:val="28"/>
-        </w:rPr>
-        <w:t xml:space="preserve">create charts and timeline instances, and add eventlisteners to the elements. </w:t>
+        <w:t xml:space="preserve">the main </w:t>
+      </w:r>
+      <w:r>
+        <w:rPr>
+          <w:sz w:val="28"/>
+          <w:szCs w:val="28"/>
+        </w:rPr>
+        <w:t>JavaScript</w:t>
+      </w:r>
+      <w:r>
+        <w:rPr>
+          <w:sz w:val="28"/>
+          <w:szCs w:val="28"/>
+        </w:rPr>
+        <w:t xml:space="preserve"> code is in app.js. It will create instances of multiple made classes that are designed for fetching data from the server, </w:t>
+      </w:r>
+      <w:proofErr w:type="gramStart"/>
+      <w:r>
+        <w:rPr>
+          <w:sz w:val="28"/>
+          <w:szCs w:val="28"/>
+        </w:rPr>
+        <w:t>rendering</w:t>
+      </w:r>
+      <w:r>
+        <w:rPr>
+          <w:sz w:val="28"/>
+          <w:szCs w:val="28"/>
+        </w:rPr>
+        <w:t xml:space="preserve">  HTMLs</w:t>
+      </w:r>
+      <w:proofErr w:type="gramEnd"/>
+      <w:r>
+        <w:rPr>
+          <w:sz w:val="28"/>
+          <w:szCs w:val="28"/>
+        </w:rPr>
+        <w:t xml:space="preserve"> and creating charts. It starts with fetching </w:t>
+      </w:r>
+      <w:proofErr w:type="gramStart"/>
+      <w:r>
+        <w:rPr>
+          <w:sz w:val="28"/>
+          <w:szCs w:val="28"/>
+        </w:rPr>
+        <w:t xml:space="preserve">data </w:t>
+      </w:r>
+      <w:r>
+        <w:rPr>
+          <w:sz w:val="28"/>
+          <w:szCs w:val="28"/>
+        </w:rPr>
+        <w:t xml:space="preserve"> from</w:t>
+      </w:r>
+      <w:proofErr w:type="gramEnd"/>
+      <w:r>
+        <w:rPr>
+          <w:sz w:val="28"/>
+          <w:szCs w:val="28"/>
+        </w:rPr>
+        <w:t xml:space="preserve"> the s</w:t>
+      </w:r>
+      <w:r>
+        <w:rPr>
+          <w:sz w:val="28"/>
+          <w:szCs w:val="28"/>
+        </w:rPr>
+        <w:t>e</w:t>
+      </w:r>
+      <w:r>
+        <w:rPr>
+          <w:sz w:val="28"/>
+          <w:szCs w:val="28"/>
+        </w:rPr>
+        <w:t xml:space="preserve">rver, initializing template engine instances and rendering </w:t>
+      </w:r>
+      <w:r>
+        <w:rPr>
+          <w:sz w:val="28"/>
+          <w:szCs w:val="28"/>
+        </w:rPr>
+        <w:t>HTML</w:t>
+      </w:r>
+      <w:r>
+        <w:rPr>
+          <w:sz w:val="28"/>
+          <w:szCs w:val="28"/>
+        </w:rPr>
+        <w:t xml:space="preserve">s for each page, </w:t>
+      </w:r>
+      <w:r>
+        <w:rPr>
+          <w:sz w:val="28"/>
+          <w:szCs w:val="28"/>
+        </w:rPr>
+        <w:t xml:space="preserve">create charts and timeline instances, and add </w:t>
+      </w:r>
+      <w:r>
+        <w:rPr>
+          <w:sz w:val="28"/>
+          <w:szCs w:val="28"/>
+        </w:rPr>
+        <w:t>event listeners</w:t>
+      </w:r>
+      <w:r>
+        <w:rPr>
+          <w:sz w:val="28"/>
+          <w:szCs w:val="28"/>
+        </w:rPr>
+        <w:t xml:space="preserve"> to the elements. </w:t>
       </w:r>
     </w:p>
     <w:p>
@@ -1001,7 +1624,23 @@
           <w:sz w:val="28"/>
           <w:szCs w:val="28"/>
         </w:rPr>
-        <w:t xml:space="preserve">The event listeners on the timeline items enables app to scroll to the corresponding content when items are clicked. To achieve this feature I used </w:t>
+        <w:t xml:space="preserve">The event listeners on the timeline items enables app to scroll to the corresponding content when items are clicked. To achieve this </w:t>
+      </w:r>
+      <w:proofErr w:type="gramStart"/>
+      <w:r>
+        <w:rPr>
+          <w:sz w:val="28"/>
+          <w:szCs w:val="28"/>
+        </w:rPr>
+        <w:t>feature</w:t>
+      </w:r>
+      <w:proofErr w:type="gramEnd"/>
+      <w:r>
+        <w:rPr>
+          <w:sz w:val="28"/>
+          <w:szCs w:val="28"/>
+        </w:rPr>
+        <w:t xml:space="preserve"> I used </w:t>
       </w:r>
       <w:r>
         <w:rPr>
@@ -1022,7 +1661,23 @@
           <w:sz w:val="28"/>
           <w:szCs w:val="28"/>
         </w:rPr>
-        <w:t xml:space="preserve"> to link element div of each history item to the items in the vis-timeline[7].</w:t>
+        <w:t xml:space="preserve"> to link element div of each history item to the items in the vis-</w:t>
+      </w:r>
+      <w:proofErr w:type="gramStart"/>
+      <w:r>
+        <w:rPr>
+          <w:sz w:val="28"/>
+          <w:szCs w:val="28"/>
+        </w:rPr>
+        <w:t>timeline[</w:t>
+      </w:r>
+      <w:proofErr w:type="gramEnd"/>
+      <w:r>
+        <w:rPr>
+          <w:sz w:val="28"/>
+          <w:szCs w:val="28"/>
+        </w:rPr>
+        <w:t>7].</w:t>
       </w:r>
     </w:p>
     <w:p>
@@ -1038,7 +1693,61 @@
           <w:sz w:val="28"/>
           <w:szCs w:val="28"/>
         </w:rPr>
-        <w:t xml:space="preserve">For the statistics data from Statcan, I used charts.js [8]. I created a LineChart class to use it for line charts. It takes the data and and generated the chart based on the provided parameters and data sets at the moment of initializing the instance.  The LineChart is also a partnt for other type of chart classes, which are DoughnutChart, Polarchart, and Barchart. The updateDataset() function for these child classes are overwritten and customized so they provide the desired output. </w:t>
+        <w:t xml:space="preserve">For the statistics data from Statcan, I used charts.js [8]. I created a LineChart class to use it for line charts. It takes the data and and generated the chart based on the provided parameters and data sets </w:t>
+      </w:r>
+      <w:proofErr w:type="gramStart"/>
+      <w:r>
+        <w:rPr>
+          <w:sz w:val="28"/>
+          <w:szCs w:val="28"/>
+        </w:rPr>
+        <w:t>at the moment</w:t>
+      </w:r>
+      <w:proofErr w:type="gramEnd"/>
+      <w:r>
+        <w:rPr>
+          <w:sz w:val="28"/>
+          <w:szCs w:val="28"/>
+        </w:rPr>
+        <w:t xml:space="preserve"> of initializing the instance.  The LineChart is also a </w:t>
+      </w:r>
+      <w:r>
+        <w:rPr>
+          <w:sz w:val="28"/>
+          <w:szCs w:val="28"/>
+        </w:rPr>
+        <w:t>parent</w:t>
+      </w:r>
+      <w:r>
+        <w:rPr>
+          <w:sz w:val="28"/>
+          <w:szCs w:val="28"/>
+        </w:rPr>
+        <w:t xml:space="preserve"> for other type of chart classes, which are DoughnutChart, Polarchart, and Barchart. The </w:t>
+      </w:r>
+      <w:proofErr w:type="gramStart"/>
+      <w:r>
+        <w:rPr>
+          <w:sz w:val="28"/>
+          <w:szCs w:val="28"/>
+        </w:rPr>
+        <w:t>updateDataset(</w:t>
+      </w:r>
+      <w:proofErr w:type="gramEnd"/>
+      <w:r>
+        <w:rPr>
+          <w:sz w:val="28"/>
+          <w:szCs w:val="28"/>
+        </w:rPr>
+        <w:t xml:space="preserve">) </w:t>
+      </w:r>
+      <w:r>
+        <w:rPr>
+          <w:sz w:val="28"/>
+          <w:szCs w:val="28"/>
+        </w:rPr>
+        <w:lastRenderedPageBreak/>
+        <w:t xml:space="preserve">function for these child classes are overwritten and customized so they provide the desired output. </w:t>
       </w:r>
     </w:p>
     <w:p>
@@ -1134,22 +1843,42 @@
           <w:sz w:val="28"/>
           <w:szCs w:val="28"/>
         </w:rPr>
-        <w:t xml:space="preserve">s which are provided by template engins based on the opened page. Template </w:t>
-      </w:r>
-      <w:r>
-        <w:rPr>
-          <w:sz w:val="28"/>
-          <w:szCs w:val="28"/>
-        </w:rPr>
-        <w:t xml:space="preserve">engines take the relavent data which are already fetched via APIs from the server and replace data with the placeholders. The base code of </w:t>
-      </w:r>
-      <w:r>
-        <w:rPr>
-          <w:sz w:val="28"/>
-          <w:szCs w:val="28"/>
-        </w:rPr>
-        <w:lastRenderedPageBreak/>
-        <w:t xml:space="preserve">template engines </w:t>
+        <w:t xml:space="preserve">s which are provided by template </w:t>
+      </w:r>
+      <w:r>
+        <w:rPr>
+          <w:sz w:val="28"/>
+          <w:szCs w:val="28"/>
+        </w:rPr>
+        <w:t>engines</w:t>
+      </w:r>
+      <w:r>
+        <w:rPr>
+          <w:sz w:val="28"/>
+          <w:szCs w:val="28"/>
+        </w:rPr>
+        <w:t xml:space="preserve"> based on the opened page. Template </w:t>
+      </w:r>
+      <w:r>
+        <w:rPr>
+          <w:sz w:val="28"/>
+          <w:szCs w:val="28"/>
+        </w:rPr>
+        <w:t xml:space="preserve">engines take the </w:t>
+      </w:r>
+      <w:r>
+        <w:rPr>
+          <w:sz w:val="28"/>
+          <w:szCs w:val="28"/>
+        </w:rPr>
+        <w:t>relevant</w:t>
+      </w:r>
+      <w:r>
+        <w:rPr>
+          <w:sz w:val="28"/>
+          <w:szCs w:val="28"/>
+        </w:rPr>
+        <w:t xml:space="preserve"> data which are already fetched via APIs from the server and replace data with the placeholders. The base code of template engines </w:t>
       </w:r>
       <w:r>
         <w:rPr>
@@ -1163,7 +1892,21 @@
           <w:sz w:val="28"/>
           <w:szCs w:val="28"/>
         </w:rPr>
-        <w:t xml:space="preserve"> inspired from the week 11 and week 12 of the module CM1040. The chalange for the history_template_engine was that there </w:t>
+        <w:t xml:space="preserve"> inspired from the week 11 and week 12 of the module CM1040. The </w:t>
+      </w:r>
+      <w:r>
+        <w:rPr>
+          <w:sz w:val="28"/>
+          <w:szCs w:val="28"/>
+        </w:rPr>
+        <w:t>challenge</w:t>
+      </w:r>
+      <w:r>
+        <w:rPr>
+          <w:sz w:val="28"/>
+          <w:szCs w:val="28"/>
+        </w:rPr>
+        <w:t xml:space="preserve"> for the history_template_engine was that there </w:t>
       </w:r>
       <w:r>
         <w:rPr>
@@ -1177,7 +1920,21 @@
           <w:sz w:val="28"/>
           <w:szCs w:val="28"/>
         </w:rPr>
-        <w:t xml:space="preserve"> some nested arrays in the data and regular expressions could not identify whick {{/each}} is for which loop in nested loops. To address </w:t>
+        <w:t xml:space="preserve"> some nested arrays in the data and regular expressions could not identify whic</w:t>
+      </w:r>
+      <w:r>
+        <w:rPr>
+          <w:sz w:val="28"/>
+          <w:szCs w:val="28"/>
+        </w:rPr>
+        <w:t xml:space="preserve">h </w:t>
+      </w:r>
+      <w:r>
+        <w:rPr>
+          <w:sz w:val="28"/>
+          <w:szCs w:val="28"/>
+        </w:rPr>
+        <w:t xml:space="preserve">{{/each}} is for which loop in nested loops. To address </w:t>
       </w:r>
       <w:r>
         <w:rPr>
@@ -1219,14 +1976,14 @@
           <w:sz w:val="28"/>
           <w:szCs w:val="28"/>
         </w:rPr>
-        <w:t>emebed a fragment html template</w:t>
-      </w:r>
-      <w:r>
-        <w:rPr>
-          <w:sz w:val="28"/>
-          <w:szCs w:val="28"/>
-        </w:rPr>
-        <w:t xml:space="preserve"> for each item, and then </w:t>
+        <w:t>embeds</w:t>
+      </w:r>
+      <w:r>
+        <w:rPr>
+          <w:sz w:val="28"/>
+          <w:szCs w:val="28"/>
+        </w:rPr>
+        <w:t xml:space="preserve"> a fragment html template for each item, and then </w:t>
       </w:r>
       <w:r>
         <w:rPr>
@@ -1263,7 +2020,35 @@
           <w:sz w:val="28"/>
           <w:szCs w:val="28"/>
         </w:rPr>
-        <w:t xml:space="preserve">The element div in the body is reserved for a dialog form. The contnet of div will be replaced with the coontribute_dialog.html, when user navigates to the technology of legislation page and it provides tool to users so they can conteribute to the content of the page. </w:t>
+        <w:t xml:space="preserve">The element div in the body is reserved for a dialog form. The </w:t>
+      </w:r>
+      <w:r>
+        <w:rPr>
+          <w:sz w:val="28"/>
+          <w:szCs w:val="28"/>
+        </w:rPr>
+        <w:t>content</w:t>
+      </w:r>
+      <w:r>
+        <w:rPr>
+          <w:sz w:val="28"/>
+          <w:szCs w:val="28"/>
+        </w:rPr>
+        <w:t xml:space="preserve"> of div will be replaced with the coontribute_dialog.html, when user navigates to the technology of legislation page and it provides tool to users so they can </w:t>
+      </w:r>
+      <w:r>
+        <w:rPr>
+          <w:sz w:val="28"/>
+          <w:szCs w:val="28"/>
+        </w:rPr>
+        <w:t>contribute</w:t>
+      </w:r>
+      <w:r>
+        <w:rPr>
+          <w:sz w:val="28"/>
+          <w:szCs w:val="28"/>
+        </w:rPr>
+        <w:t xml:space="preserve"> to the content of the page. </w:t>
       </w:r>
     </w:p>
     <w:p>
@@ -1283,7 +2068,34 @@
           <w:sz w:val="28"/>
           <w:szCs w:val="28"/>
         </w:rPr>
-        <w:t>Styling:</w:t>
+        <w:t>Styling</w:t>
+      </w:r>
+      <w:r>
+        <w:rPr>
+          <w:b/>
+          <w:bCs/>
+          <w:sz w:val="28"/>
+          <w:szCs w:val="28"/>
+        </w:rPr>
+        <w:t xml:space="preserve"> and </w:t>
+      </w:r>
+      <w:r>
+        <w:rPr>
+          <w:b/>
+          <w:bCs/>
+          <w:sz w:val="28"/>
+          <w:szCs w:val="28"/>
+        </w:rPr>
+        <w:t>layout</w:t>
+      </w:r>
+      <w:r>
+        <w:rPr>
+          <w:b/>
+          <w:bCs/>
+          <w:sz w:val="28"/>
+          <w:szCs w:val="28"/>
+        </w:rPr>
+        <w:t>:</w:t>
       </w:r>
     </w:p>
     <w:p>
@@ -1327,7 +2139,23 @@
           <w:sz w:val="28"/>
           <w:szCs w:val="28"/>
         </w:rPr>
-        <w:t>Up to 768px : Small tablets and phones</w:t>
+        <w:t>Up to 768</w:t>
+      </w:r>
+      <w:proofErr w:type="gramStart"/>
+      <w:r>
+        <w:rPr>
+          <w:sz w:val="28"/>
+          <w:szCs w:val="28"/>
+        </w:rPr>
+        <w:t>px :</w:t>
+      </w:r>
+      <w:proofErr w:type="gramEnd"/>
+      <w:r>
+        <w:rPr>
+          <w:sz w:val="28"/>
+          <w:szCs w:val="28"/>
+        </w:rPr>
+        <w:t xml:space="preserve"> Small tablets and phones</w:t>
       </w:r>
     </w:p>
     <w:p>
@@ -1392,7 +2220,196 @@
           <w:sz w:val="28"/>
           <w:szCs w:val="28"/>
         </w:rPr>
-        <w:t xml:space="preserve">three css variables for colors so they can be applied throughout the stylsheet and give the project a consistent theme.  </w:t>
+        <w:t xml:space="preserve">three css variables for colors so they can be applied throughout the </w:t>
+      </w:r>
+      <w:r>
+        <w:rPr>
+          <w:sz w:val="28"/>
+          <w:szCs w:val="28"/>
+        </w:rPr>
+        <w:t>stylesheet</w:t>
+      </w:r>
+      <w:r>
+        <w:rPr>
+          <w:sz w:val="28"/>
+          <w:szCs w:val="28"/>
+        </w:rPr>
+        <w:t xml:space="preserve"> and give the project a consistent theme.</w:t>
+      </w:r>
+      <w:r>
+        <w:rPr>
+          <w:sz w:val="28"/>
+          <w:szCs w:val="28"/>
+        </w:rPr>
+        <w:t xml:space="preserve"> </w:t>
+      </w:r>
+      <w:proofErr w:type="gramStart"/>
+      <w:r>
+        <w:rPr>
+          <w:sz w:val="28"/>
+          <w:szCs w:val="28"/>
+        </w:rPr>
+        <w:t>In order to</w:t>
+      </w:r>
+      <w:proofErr w:type="gramEnd"/>
+      <w:r>
+        <w:rPr>
+          <w:sz w:val="28"/>
+          <w:szCs w:val="28"/>
+        </w:rPr>
+        <w:t xml:space="preserve"> </w:t>
+      </w:r>
+      <w:r>
+        <w:rPr>
+          <w:sz w:val="28"/>
+          <w:szCs w:val="28"/>
+        </w:rPr>
+        <w:t>validate the</w:t>
+      </w:r>
+      <w:r>
+        <w:rPr>
+          <w:sz w:val="28"/>
+          <w:szCs w:val="28"/>
+        </w:rPr>
+        <w:t xml:space="preserve"> HTML</w:t>
+      </w:r>
+      <w:r>
+        <w:rPr>
+          <w:sz w:val="28"/>
+          <w:szCs w:val="28"/>
+        </w:rPr>
+        <w:t xml:space="preserve">, check accessibility, and share the work with others, I deployed </w:t>
+      </w:r>
+      <w:proofErr w:type="gramStart"/>
+      <w:r>
+        <w:rPr>
+          <w:sz w:val="28"/>
+          <w:szCs w:val="28"/>
+        </w:rPr>
+        <w:t>the  web</w:t>
+      </w:r>
+      <w:proofErr w:type="gramEnd"/>
+      <w:r>
+        <w:rPr>
+          <w:sz w:val="28"/>
+          <w:szCs w:val="28"/>
+        </w:rPr>
+        <w:t xml:space="preserve"> site by cloning the git repository </w:t>
+      </w:r>
+      <w:r>
+        <w:rPr>
+          <w:sz w:val="28"/>
+          <w:szCs w:val="28"/>
+        </w:rPr>
+        <w:t xml:space="preserve"> </w:t>
+      </w:r>
+      <w:r>
+        <w:rPr>
+          <w:sz w:val="28"/>
+          <w:szCs w:val="28"/>
+        </w:rPr>
+        <w:t xml:space="preserve"> </w:t>
+      </w:r>
+      <w:r>
+        <w:rPr>
+          <w:sz w:val="28"/>
+          <w:szCs w:val="28"/>
+        </w:rPr>
+        <w:t xml:space="preserve">into the Render and </w:t>
+      </w:r>
+      <w:proofErr w:type="gramStart"/>
+      <w:r>
+        <w:rPr>
+          <w:sz w:val="28"/>
+          <w:szCs w:val="28"/>
+        </w:rPr>
+        <w:t>built  an</w:t>
+      </w:r>
+      <w:proofErr w:type="gramEnd"/>
+      <w:r>
+        <w:rPr>
+          <w:sz w:val="28"/>
+          <w:szCs w:val="28"/>
+        </w:rPr>
+        <w:t xml:space="preserve"> </w:t>
+      </w:r>
+      <w:r>
+        <w:rPr>
+          <w:sz w:val="28"/>
+          <w:szCs w:val="28"/>
+        </w:rPr>
+        <w:t>project</w:t>
+      </w:r>
+      <w:r>
+        <w:rPr>
+          <w:sz w:val="28"/>
+          <w:szCs w:val="28"/>
+        </w:rPr>
+        <w:t xml:space="preserve"> there</w:t>
+      </w:r>
+      <w:r>
+        <w:rPr>
+          <w:sz w:val="28"/>
+          <w:szCs w:val="28"/>
+        </w:rPr>
+        <w:t xml:space="preserve">. The URL address for the created website is </w:t>
+      </w:r>
+      <w:hyperlink r:id="rId8" w:history="1">
+        <w:r>
+          <w:rPr>
+            <w:rStyle w:val="Hyperlink"/>
+            <w:sz w:val="28"/>
+            <w:szCs w:val="28"/>
+          </w:rPr>
+          <w:t>https://internet-</w:t>
+        </w:r>
+        <w:r>
+          <w:rPr>
+            <w:rStyle w:val="Hyperlink"/>
+            <w:sz w:val="28"/>
+            <w:szCs w:val="28"/>
+          </w:rPr>
+          <w:lastRenderedPageBreak/>
+          <w:t>history-project.onrender.com</w:t>
+        </w:r>
+      </w:hyperlink>
+      <w:r>
+        <w:rPr>
+          <w:sz w:val="28"/>
+          <w:szCs w:val="28"/>
+        </w:rPr>
+        <w:t xml:space="preserve">. I used this for HTML validation in </w:t>
+      </w:r>
+      <w:hyperlink r:id="rId9" w:history="1">
+        <w:r>
+          <w:rPr>
+            <w:rStyle w:val="Hyperlink"/>
+            <w:sz w:val="28"/>
+            <w:szCs w:val="28"/>
+          </w:rPr>
+          <w:t>https://validator.w3.org</w:t>
+        </w:r>
+      </w:hyperlink>
+      <w:r>
+        <w:rPr>
+          <w:sz w:val="28"/>
+          <w:szCs w:val="28"/>
+        </w:rPr>
+        <w:t xml:space="preserve"> and the result was as </w:t>
+      </w:r>
+      <w:r>
+        <w:rPr>
+          <w:sz w:val="28"/>
+          <w:szCs w:val="28"/>
+        </w:rPr>
+        <w:t>following</w:t>
+      </w:r>
+      <w:r>
+        <w:rPr>
+          <w:sz w:val="28"/>
+          <w:szCs w:val="28"/>
+        </w:rPr>
+        <w:t>:</w:t>
       </w:r>
     </w:p>
     <w:p>
@@ -1403,6 +2420,70 @@
           <w:szCs w:val="28"/>
         </w:rPr>
       </w:pPr>
+      <w:r>
+        <w:rPr>
+          <w:noProof/>
+          <w:sz w:val="28"/>
+          <w:szCs w:val="28"/>
+        </w:rPr>
+        <w:drawing>
+          <wp:inline distT="0" distB="0" distL="0" distR="0" wp14:anchorId="16467E5D" wp14:editId="6B316240">
+            <wp:extent cx="5943600" cy="3451860"/>
+            <wp:effectExtent l="19050" t="19050" r="19050" b="15240"/>
+            <wp:docPr id="1625255664" name="Picture 1"/>
+            <wp:cNvGraphicFramePr>
+              <a:graphicFrameLocks xmlns:a="http://schemas.openxmlformats.org/drawingml/2006/main" noChangeAspect="1"/>
+            </wp:cNvGraphicFramePr>
+            <a:graphic xmlns:a="http://schemas.openxmlformats.org/drawingml/2006/main">
+              <a:graphicData uri="http://schemas.openxmlformats.org/drawingml/2006/picture">
+                <pic:pic xmlns:pic="http://schemas.openxmlformats.org/drawingml/2006/picture">
+                  <pic:nvPicPr>
+                    <pic:cNvPr id="1625255664" name=""/>
+                    <pic:cNvPicPr/>
+                  </pic:nvPicPr>
+                  <pic:blipFill>
+                    <a:blip r:embed="rId10"/>
+                    <a:stretch>
+                      <a:fillRect/>
+                    </a:stretch>
+                  </pic:blipFill>
+                  <pic:spPr>
+                    <a:xfrm>
+                      <a:off x="0" y="0"/>
+                      <a:ext cx="5943600" cy="3451860"/>
+                    </a:xfrm>
+                    <a:prstGeom prst="rect">
+                      <a:avLst/>
+                    </a:prstGeom>
+                    <a:ln>
+                      <a:solidFill>
+                        <a:schemeClr val="accent1"/>
+                      </a:solidFill>
+                    </a:ln>
+                  </pic:spPr>
+                </pic:pic>
+              </a:graphicData>
+            </a:graphic>
+          </wp:inline>
+        </w:drawing>
+      </w:r>
+    </w:p>
+    <w:p>
+      <w:pPr>
+        <w:spacing w:after="240" w:line="240" w:lineRule="auto"/>
+        <w:jc w:val="center"/>
+        <w:rPr>
+          <w:sz w:val="28"/>
+          <w:szCs w:val="28"/>
+        </w:rPr>
+      </w:pPr>
+      <w:r>
+        <w:rPr>
+          <w:sz w:val="28"/>
+          <w:szCs w:val="28"/>
+        </w:rPr>
+        <w:t>Image 1- First result from W3C Markup Validation Service</w:t>
+      </w:r>
     </w:p>
     <w:p>
       <w:pPr>
@@ -1412,28 +2493,434 @@
           <w:szCs w:val="28"/>
         </w:rPr>
       </w:pPr>
-    </w:p>
-    <w:p>
-      <w:pPr>
-        <w:jc w:val="both"/>
-        <w:rPr>
-          <w:sz w:val="28"/>
-          <w:szCs w:val="28"/>
-        </w:rPr>
-      </w:pPr>
-    </w:p>
-    <w:p>
-      <w:pPr>
-        <w:jc w:val="both"/>
-        <w:rPr>
-          <w:sz w:val="28"/>
-          <w:szCs w:val="28"/>
-        </w:rPr>
-      </w:pPr>
-    </w:p>
-    <w:p>
-      <w:pPr>
-        <w:jc w:val="both"/>
+      <w:r>
+        <w:rPr>
+          <w:sz w:val="28"/>
+          <w:szCs w:val="28"/>
+        </w:rPr>
+        <w:t xml:space="preserve">to address the </w:t>
+      </w:r>
+      <w:proofErr w:type="gramStart"/>
+      <w:r>
+        <w:rPr>
+          <w:sz w:val="28"/>
+          <w:szCs w:val="28"/>
+        </w:rPr>
+        <w:t>errors</w:t>
+      </w:r>
+      <w:proofErr w:type="gramEnd"/>
+      <w:r>
+        <w:rPr>
+          <w:sz w:val="28"/>
+          <w:szCs w:val="28"/>
+        </w:rPr>
+        <w:t xml:space="preserve"> I performed followings:</w:t>
+      </w:r>
+    </w:p>
+    <w:p>
+      <w:pPr>
+        <w:rPr>
+          <w:sz w:val="28"/>
+          <w:szCs w:val="28"/>
+        </w:rPr>
+      </w:pPr>
+      <w:r>
+        <w:rPr>
+          <w:sz w:val="28"/>
+          <w:szCs w:val="28"/>
+        </w:rPr>
+        <w:t>I</w:t>
+      </w:r>
+      <w:r>
+        <w:rPr>
+          <w:sz w:val="28"/>
+          <w:szCs w:val="28"/>
+        </w:rPr>
+        <w:t>tem</w:t>
+      </w:r>
+      <w:r>
+        <w:rPr>
+          <w:sz w:val="28"/>
+          <w:szCs w:val="28"/>
+        </w:rPr>
+        <w:t xml:space="preserve"> </w:t>
+      </w:r>
+      <w:r>
+        <w:rPr>
+          <w:sz w:val="28"/>
+          <w:szCs w:val="28"/>
+        </w:rPr>
+        <w:t xml:space="preserve">1: </w:t>
+      </w:r>
+      <w:r>
+        <w:rPr>
+          <w:sz w:val="28"/>
+          <w:szCs w:val="28"/>
+        </w:rPr>
+        <w:t>R</w:t>
+      </w:r>
+      <w:r>
+        <w:rPr>
+          <w:sz w:val="28"/>
+          <w:szCs w:val="28"/>
+        </w:rPr>
+        <w:t>emoved roll</w:t>
+      </w:r>
+      <w:proofErr w:type="gramStart"/>
+      <w:r>
+        <w:rPr>
+          <w:sz w:val="28"/>
+          <w:szCs w:val="28"/>
+        </w:rPr>
+        <w:t>=”toolbar</w:t>
+      </w:r>
+      <w:proofErr w:type="gramEnd"/>
+      <w:r>
+        <w:rPr>
+          <w:sz w:val="28"/>
+          <w:szCs w:val="28"/>
+        </w:rPr>
+        <w:t xml:space="preserve">” from &lt;div&gt; and added </w:t>
+      </w:r>
+      <w:r>
+        <w:rPr>
+          <w:sz w:val="28"/>
+          <w:szCs w:val="28"/>
+        </w:rPr>
+        <w:t xml:space="preserve">role="navigation" </w:t>
+      </w:r>
+      <w:r>
+        <w:rPr>
+          <w:sz w:val="28"/>
+          <w:szCs w:val="28"/>
+        </w:rPr>
+        <w:t xml:space="preserve">and </w:t>
+      </w:r>
+      <w:r>
+        <w:rPr>
+          <w:sz w:val="28"/>
+          <w:szCs w:val="28"/>
+        </w:rPr>
+        <w:t>aria-label="Navigation between pages"</w:t>
+      </w:r>
+      <w:r>
+        <w:rPr>
+          <w:sz w:val="28"/>
+          <w:szCs w:val="28"/>
+        </w:rPr>
+        <w:t xml:space="preserve"> to it [10].</w:t>
+      </w:r>
+    </w:p>
+    <w:p>
+      <w:pPr>
+        <w:rPr>
+          <w:sz w:val="28"/>
+          <w:szCs w:val="28"/>
+        </w:rPr>
+      </w:pPr>
+      <w:r>
+        <w:rPr>
+          <w:sz w:val="28"/>
+          <w:szCs w:val="28"/>
+        </w:rPr>
+        <w:t>Item 2 to Item 5: Removed role</w:t>
+      </w:r>
+      <w:proofErr w:type="gramStart"/>
+      <w:r>
+        <w:rPr>
+          <w:sz w:val="28"/>
+          <w:szCs w:val="28"/>
+        </w:rPr>
+        <w:t>=”button</w:t>
+      </w:r>
+      <w:proofErr w:type="gramEnd"/>
+      <w:r>
+        <w:rPr>
+          <w:sz w:val="28"/>
+          <w:szCs w:val="28"/>
+        </w:rPr>
+        <w:t>”</w:t>
+      </w:r>
+    </w:p>
+    <w:p>
+      <w:pPr>
+        <w:rPr>
+          <w:sz w:val="28"/>
+          <w:szCs w:val="28"/>
+        </w:rPr>
+      </w:pPr>
+      <w:r>
+        <w:rPr>
+          <w:sz w:val="28"/>
+          <w:szCs w:val="28"/>
+        </w:rPr>
+        <w:t>Item 6: Removed rolw</w:t>
+      </w:r>
+      <w:proofErr w:type="gramStart"/>
+      <w:r>
+        <w:rPr>
+          <w:sz w:val="28"/>
+          <w:szCs w:val="28"/>
+        </w:rPr>
+        <w:t>=”dialog</w:t>
+      </w:r>
+      <w:proofErr w:type="gramEnd"/>
+      <w:r>
+        <w:rPr>
+          <w:sz w:val="28"/>
+          <w:szCs w:val="28"/>
+        </w:rPr>
+        <w:t>” and added role</w:t>
+      </w:r>
+      <w:proofErr w:type="gramStart"/>
+      <w:r>
+        <w:rPr>
+          <w:sz w:val="28"/>
+          <w:szCs w:val="28"/>
+        </w:rPr>
+        <w:t>=”form</w:t>
+      </w:r>
+      <w:proofErr w:type="gramEnd"/>
+      <w:r>
+        <w:rPr>
+          <w:sz w:val="28"/>
+          <w:szCs w:val="28"/>
+        </w:rPr>
+        <w:t xml:space="preserve"> ” and </w:t>
+      </w:r>
+      <w:r>
+        <w:rPr>
+          <w:sz w:val="28"/>
+          <w:szCs w:val="28"/>
+        </w:rPr>
+        <w:t>aria-label="Navigation between pages"</w:t>
+      </w:r>
+      <w:r>
+        <w:rPr>
+          <w:sz w:val="28"/>
+          <w:szCs w:val="28"/>
+        </w:rPr>
+        <w:t xml:space="preserve"> to the &lt;div&gt;</w:t>
+      </w:r>
+    </w:p>
+    <w:p>
+      <w:pPr>
+        <w:rPr>
+          <w:sz w:val="28"/>
+          <w:szCs w:val="28"/>
+        </w:rPr>
+      </w:pPr>
+      <w:r>
+        <w:rPr>
+          <w:sz w:val="28"/>
+          <w:szCs w:val="28"/>
+        </w:rPr>
+        <w:lastRenderedPageBreak/>
+        <w:t xml:space="preserve">The result after </w:t>
+      </w:r>
+      <w:r>
+        <w:rPr>
+          <w:sz w:val="28"/>
+          <w:szCs w:val="28"/>
+        </w:rPr>
+        <w:t>modification</w:t>
+      </w:r>
+      <w:r>
+        <w:rPr>
+          <w:sz w:val="28"/>
+          <w:szCs w:val="28"/>
+        </w:rPr>
+        <w:t xml:space="preserve"> was as following:</w:t>
+      </w:r>
+      <w:r>
+        <w:rPr>
+          <w:sz w:val="28"/>
+          <w:szCs w:val="28"/>
+        </w:rPr>
+        <w:br/>
+      </w:r>
+      <w:r>
+        <w:rPr>
+          <w:noProof/>
+          <w:sz w:val="28"/>
+          <w:szCs w:val="28"/>
+        </w:rPr>
+        <w:drawing>
+          <wp:inline distT="0" distB="0" distL="0" distR="0" wp14:anchorId="3E01E799" wp14:editId="0553B524">
+            <wp:extent cx="5943600" cy="3477260"/>
+            <wp:effectExtent l="19050" t="19050" r="19050" b="27940"/>
+            <wp:docPr id="1395140570" name="Picture 1"/>
+            <wp:cNvGraphicFramePr>
+              <a:graphicFrameLocks xmlns:a="http://schemas.openxmlformats.org/drawingml/2006/main" noChangeAspect="1"/>
+            </wp:cNvGraphicFramePr>
+            <a:graphic xmlns:a="http://schemas.openxmlformats.org/drawingml/2006/main">
+              <a:graphicData uri="http://schemas.openxmlformats.org/drawingml/2006/picture">
+                <pic:pic xmlns:pic="http://schemas.openxmlformats.org/drawingml/2006/picture">
+                  <pic:nvPicPr>
+                    <pic:cNvPr id="1395140570" name=""/>
+                    <pic:cNvPicPr/>
+                  </pic:nvPicPr>
+                  <pic:blipFill>
+                    <a:blip r:embed="rId11"/>
+                    <a:stretch>
+                      <a:fillRect/>
+                    </a:stretch>
+                  </pic:blipFill>
+                  <pic:spPr>
+                    <a:xfrm>
+                      <a:off x="0" y="0"/>
+                      <a:ext cx="5943600" cy="3477260"/>
+                    </a:xfrm>
+                    <a:prstGeom prst="rect">
+                      <a:avLst/>
+                    </a:prstGeom>
+                    <a:ln>
+                      <a:solidFill>
+                        <a:schemeClr val="accent1"/>
+                      </a:solidFill>
+                    </a:ln>
+                  </pic:spPr>
+                </pic:pic>
+              </a:graphicData>
+            </a:graphic>
+          </wp:inline>
+        </w:drawing>
+      </w:r>
+    </w:p>
+    <w:p>
+      <w:pPr>
+        <w:spacing w:after="240" w:line="240" w:lineRule="auto"/>
+        <w:jc w:val="center"/>
+        <w:rPr>
+          <w:sz w:val="28"/>
+          <w:szCs w:val="28"/>
+        </w:rPr>
+      </w:pPr>
+      <w:r>
+        <w:rPr>
+          <w:sz w:val="28"/>
+          <w:szCs w:val="28"/>
+        </w:rPr>
+        <w:t>Image 2- Second result from W3C Markup Validation Service</w:t>
+      </w:r>
+    </w:p>
+    <w:p>
+      <w:pPr>
+        <w:rPr>
+          <w:sz w:val="28"/>
+          <w:szCs w:val="28"/>
+        </w:rPr>
+      </w:pPr>
+      <w:r>
+        <w:rPr>
+          <w:sz w:val="28"/>
+          <w:szCs w:val="28"/>
+        </w:rPr>
+        <w:t xml:space="preserve">I also received the final accessibility check result from </w:t>
+      </w:r>
+      <w:hyperlink r:id="rId12" w:history="1">
+        <w:r>
+          <w:rPr>
+            <w:rStyle w:val="Hyperlink"/>
+            <w:sz w:val="28"/>
+            <w:szCs w:val="28"/>
+          </w:rPr>
+          <w:t>https://achecks.org/achecker</w:t>
+        </w:r>
+      </w:hyperlink>
+      <w:r>
+        <w:rPr>
+          <w:sz w:val="28"/>
+          <w:szCs w:val="28"/>
+        </w:rPr>
+        <w:t xml:space="preserve"> as following:</w:t>
+      </w:r>
+    </w:p>
+    <w:p>
+      <w:pPr>
+        <w:rPr>
+          <w:sz w:val="28"/>
+          <w:szCs w:val="28"/>
+        </w:rPr>
+      </w:pPr>
+      <w:r>
+        <w:rPr>
+          <w:noProof/>
+        </w:rPr>
+        <w:drawing>
+          <wp:inline distT="0" distB="0" distL="0" distR="0" wp14:anchorId="6A3872C9" wp14:editId="48BE94F1">
+            <wp:extent cx="5943600" cy="2621915"/>
+            <wp:effectExtent l="0" t="0" r="0" b="6985"/>
+            <wp:docPr id="203866231" name="Picture 1"/>
+            <wp:cNvGraphicFramePr>
+              <a:graphicFrameLocks xmlns:a="http://schemas.openxmlformats.org/drawingml/2006/main" noChangeAspect="1"/>
+            </wp:cNvGraphicFramePr>
+            <a:graphic xmlns:a="http://schemas.openxmlformats.org/drawingml/2006/main">
+              <a:graphicData uri="http://schemas.openxmlformats.org/drawingml/2006/picture">
+                <pic:pic xmlns:pic="http://schemas.openxmlformats.org/drawingml/2006/picture">
+                  <pic:nvPicPr>
+                    <pic:cNvPr id="203866231" name=""/>
+                    <pic:cNvPicPr/>
+                  </pic:nvPicPr>
+                  <pic:blipFill>
+                    <a:blip r:embed="rId13"/>
+                    <a:stretch>
+                      <a:fillRect/>
+                    </a:stretch>
+                  </pic:blipFill>
+                  <pic:spPr>
+                    <a:xfrm>
+                      <a:off x="0" y="0"/>
+                      <a:ext cx="5943600" cy="2621915"/>
+                    </a:xfrm>
+                    <a:prstGeom prst="rect">
+                      <a:avLst/>
+                    </a:prstGeom>
+                  </pic:spPr>
+                </pic:pic>
+              </a:graphicData>
+            </a:graphic>
+          </wp:inline>
+        </w:drawing>
+      </w:r>
+    </w:p>
+    <w:p>
+      <w:pPr>
+        <w:spacing w:after="240" w:line="240" w:lineRule="auto"/>
+        <w:jc w:val="center"/>
+        <w:rPr>
+          <w:sz w:val="28"/>
+          <w:szCs w:val="28"/>
+        </w:rPr>
+      </w:pPr>
+      <w:r>
+        <w:rPr>
+          <w:sz w:val="28"/>
+          <w:szCs w:val="28"/>
+        </w:rPr>
+        <w:t xml:space="preserve">Image 3- </w:t>
+      </w:r>
+      <w:proofErr w:type="gramStart"/>
+      <w:r>
+        <w:rPr>
+          <w:sz w:val="28"/>
+          <w:szCs w:val="28"/>
+        </w:rPr>
+        <w:t>Final result</w:t>
+      </w:r>
+      <w:proofErr w:type="gramEnd"/>
+      <w:r>
+        <w:rPr>
+          <w:sz w:val="28"/>
+          <w:szCs w:val="28"/>
+        </w:rPr>
+        <w:t xml:space="preserve"> from W3C Markup Validation Service</w:t>
+      </w:r>
+    </w:p>
+    <w:p>
+      <w:pPr>
+        <w:spacing w:after="240" w:line="240" w:lineRule="auto"/>
+        <w:jc w:val="center"/>
         <w:rPr>
           <w:sz w:val="28"/>
           <w:szCs w:val="28"/>
@@ -1457,6 +2944,7 @@
           <w:sz w:val="28"/>
           <w:szCs w:val="28"/>
         </w:rPr>
+        <w:lastRenderedPageBreak/>
         <w:t>References:</w:t>
       </w:r>
     </w:p>
@@ -1498,7 +2986,7 @@
           <w:szCs w:val="28"/>
         </w:rPr>
       </w:pPr>
-      <w:hyperlink r:id="rId8" w:history="1">
+      <w:hyperlink r:id="rId14" w:history="1">
         <w:r>
           <w:rPr>
             <w:sz w:val="28"/>
@@ -1556,10 +3044,25 @@
           <w:sz w:val="28"/>
           <w:szCs w:val="28"/>
         </w:rPr>
-        <w:lastRenderedPageBreak/>
-        <w:t xml:space="preserve">[2]Mozilla. “429 Too Many Requests”. Internet: </w:t>
-      </w:r>
-      <w:hyperlink r:id="rId9" w:history="1">
+        <w:t>[</w:t>
+      </w:r>
+      <w:proofErr w:type="gramStart"/>
+      <w:r>
+        <w:rPr>
+          <w:sz w:val="28"/>
+          <w:szCs w:val="28"/>
+        </w:rPr>
+        <w:t>2]Mozilla</w:t>
+      </w:r>
+      <w:proofErr w:type="gramEnd"/>
+      <w:r>
+        <w:rPr>
+          <w:sz w:val="28"/>
+          <w:szCs w:val="28"/>
+        </w:rPr>
+        <w:t xml:space="preserve">. “429 Too Many Requests”. Internet: </w:t>
+      </w:r>
+      <w:hyperlink r:id="rId15" w:history="1">
         <w:r>
           <w:rPr>
             <w:sz w:val="28"/>
@@ -1617,14 +3120,30 @@
           <w:sz w:val="28"/>
           <w:szCs w:val="28"/>
         </w:rPr>
-        <w:t>[3]</w:t>
-      </w:r>
-      <w:r>
-        <w:rPr>
-          <w:sz w:val="28"/>
-          <w:szCs w:val="28"/>
-        </w:rPr>
-        <w:t>James Hibbard</w:t>
+        <w:t>[</w:t>
+      </w:r>
+      <w:proofErr w:type="gramStart"/>
+      <w:r>
+        <w:rPr>
+          <w:sz w:val="28"/>
+          <w:szCs w:val="28"/>
+        </w:rPr>
+        <w:t>3]</w:t>
+      </w:r>
+      <w:r>
+        <w:rPr>
+          <w:sz w:val="28"/>
+          <w:szCs w:val="28"/>
+        </w:rPr>
+        <w:t>James</w:t>
+      </w:r>
+      <w:proofErr w:type="gramEnd"/>
+      <w:r>
+        <w:rPr>
+          <w:sz w:val="28"/>
+          <w:szCs w:val="28"/>
+        </w:rPr>
+        <w:t xml:space="preserve"> Hibbard</w:t>
       </w:r>
       <w:r>
         <w:rPr>
@@ -1656,7 +3175,7 @@
           <w:szCs w:val="28"/>
         </w:rPr>
       </w:pPr>
-      <w:hyperlink r:id="rId10" w:history="1">
+      <w:hyperlink r:id="rId16" w:history="1">
         <w:r>
           <w:rPr>
             <w:sz w:val="28"/>
@@ -1707,28 +3226,46 @@
           <w:sz w:val="28"/>
           <w:szCs w:val="28"/>
         </w:rPr>
-        <w:t>[4]</w:t>
-      </w:r>
-      <w:r>
-        <w:rPr>
-          <w:sz w:val="28"/>
-          <w:szCs w:val="28"/>
-        </w:rPr>
-        <w:t>unpkg</w:t>
-      </w:r>
-      <w:r>
-        <w:rPr>
-          <w:sz w:val="28"/>
-          <w:szCs w:val="28"/>
-        </w:rPr>
-        <w:t>. ”</w:t>
-      </w:r>
-      <w:r>
-        <w:rPr>
-          <w:sz w:val="28"/>
-          <w:szCs w:val="28"/>
-        </w:rPr>
-        <w:t>vis-timelin</w:t>
+        <w:t>[</w:t>
+      </w:r>
+      <w:proofErr w:type="gramStart"/>
+      <w:r>
+        <w:rPr>
+          <w:sz w:val="28"/>
+          <w:szCs w:val="28"/>
+        </w:rPr>
+        <w:t>4]unpkg</w:t>
+      </w:r>
+      <w:proofErr w:type="gramEnd"/>
+      <w:r>
+        <w:rPr>
+          <w:sz w:val="28"/>
+          <w:szCs w:val="28"/>
+        </w:rPr>
+        <w:t xml:space="preserve">. </w:t>
+      </w:r>
+      <w:proofErr w:type="gramStart"/>
+      <w:r>
+        <w:rPr>
+          <w:sz w:val="28"/>
+          <w:szCs w:val="28"/>
+        </w:rPr>
+        <w:t>”</w:t>
+      </w:r>
+      <w:r>
+        <w:rPr>
+          <w:sz w:val="28"/>
+          <w:szCs w:val="28"/>
+        </w:rPr>
+        <w:t>vis</w:t>
+      </w:r>
+      <w:proofErr w:type="gramEnd"/>
+      <w:r>
+        <w:rPr>
+          <w:sz w:val="28"/>
+          <w:szCs w:val="28"/>
+        </w:rPr>
+        <w:t>-timelin</w:t>
       </w:r>
       <w:r>
         <w:rPr>
@@ -1737,7 +3274,7 @@
         </w:rPr>
         <w:t xml:space="preserve">”. Internet: </w:t>
       </w:r>
-      <w:hyperlink r:id="rId11" w:history="1">
+      <w:hyperlink r:id="rId17" w:history="1">
         <w:r>
           <w:rPr>
             <w:sz w:val="28"/>
@@ -1802,9 +3339,41 @@
           <w:sz w:val="28"/>
           <w:szCs w:val="28"/>
         </w:rPr>
-        <w:t xml:space="preserve">[5]Github. “vis-timeline”. Internet: </w:t>
-      </w:r>
-      <w:hyperlink r:id="rId12" w:history="1">
+        <w:t>[</w:t>
+      </w:r>
+      <w:proofErr w:type="gramStart"/>
+      <w:r>
+        <w:rPr>
+          <w:sz w:val="28"/>
+          <w:szCs w:val="28"/>
+        </w:rPr>
+        <w:t>5]Github</w:t>
+      </w:r>
+      <w:proofErr w:type="gramEnd"/>
+      <w:r>
+        <w:rPr>
+          <w:sz w:val="28"/>
+          <w:szCs w:val="28"/>
+        </w:rPr>
+        <w:t>. “</w:t>
+      </w:r>
+      <w:proofErr w:type="gramStart"/>
+      <w:r>
+        <w:rPr>
+          <w:sz w:val="28"/>
+          <w:szCs w:val="28"/>
+        </w:rPr>
+        <w:t>vis</w:t>
+      </w:r>
+      <w:proofErr w:type="gramEnd"/>
+      <w:r>
+        <w:rPr>
+          <w:sz w:val="28"/>
+          <w:szCs w:val="28"/>
+        </w:rPr>
+        <w:t xml:space="preserve">-timeline”. Internet: </w:t>
+      </w:r>
+      <w:hyperlink r:id="rId18" w:history="1">
         <w:r>
           <w:rPr>
             <w:sz w:val="28"/>
@@ -1818,7 +3387,23 @@
           <w:sz w:val="28"/>
           <w:szCs w:val="28"/>
         </w:rPr>
-        <w:t>, 2026[Accessed march 7</w:t>
+        <w:t xml:space="preserve">, 2026[Accessed </w:t>
+      </w:r>
+      <w:proofErr w:type="gramStart"/>
+      <w:r>
+        <w:rPr>
+          <w:sz w:val="28"/>
+          <w:szCs w:val="28"/>
+        </w:rPr>
+        <w:t>march</w:t>
+      </w:r>
+      <w:proofErr w:type="gramEnd"/>
+      <w:r>
+        <w:rPr>
+          <w:sz w:val="28"/>
+          <w:szCs w:val="28"/>
+        </w:rPr>
+        <w:t xml:space="preserve"> 7</w:t>
       </w:r>
       <w:r>
         <w:rPr>
@@ -1855,7 +3440,15 @@
           <w:sz w:val="28"/>
           <w:szCs w:val="28"/>
         </w:rPr>
-        <w:t>[6]</w:t>
+        <w:t>[</w:t>
+      </w:r>
+      <w:proofErr w:type="gramStart"/>
+      <w:r>
+        <w:rPr>
+          <w:sz w:val="28"/>
+          <w:szCs w:val="28"/>
+        </w:rPr>
+        <w:t>6]</w:t>
       </w:r>
       <w:r>
         <w:rPr>
@@ -1864,6 +3457,7 @@
         </w:rPr>
         <w:t>unpkg</w:t>
       </w:r>
+      <w:proofErr w:type="gramEnd"/>
       <w:r>
         <w:rPr>
           <w:sz w:val="28"/>
@@ -1876,16 +3470,9 @@
           <w:sz w:val="28"/>
           <w:szCs w:val="28"/>
         </w:rPr>
-        <w:t>Timeline documentation</w:t>
-      </w:r>
-      <w:r>
-        <w:rPr>
-          <w:sz w:val="28"/>
-          <w:szCs w:val="28"/>
-        </w:rPr>
-        <w:t xml:space="preserve">”. Internet: </w:t>
-      </w:r>
-      <w:hyperlink r:id="rId13" w:history="1">
+        <w:t xml:space="preserve">Timeline documentation”. Internet: </w:t>
+      </w:r>
+      <w:hyperlink r:id="rId19" w:history="1">
         <w:r>
           <w:rPr>
             <w:sz w:val="28"/>
@@ -1922,7 +3509,23 @@
           <w:sz w:val="28"/>
           <w:szCs w:val="28"/>
         </w:rPr>
-        <w:t>[7]Mozilla. ”</w:t>
+        <w:t>[</w:t>
+      </w:r>
+      <w:proofErr w:type="gramStart"/>
+      <w:r>
+        <w:rPr>
+          <w:sz w:val="28"/>
+          <w:szCs w:val="28"/>
+        </w:rPr>
+        <w:t>7]Mozilla</w:t>
+      </w:r>
+      <w:proofErr w:type="gramEnd"/>
+      <w:r>
+        <w:rPr>
+          <w:sz w:val="28"/>
+          <w:szCs w:val="28"/>
+        </w:rPr>
+        <w:t>. ”</w:t>
       </w:r>
       <w:r>
         <w:rPr>
@@ -1938,27 +3541,13 @@
         </w:rPr>
         <w:t xml:space="preserve">”. Internet: </w:t>
       </w:r>
-      <w:hyperlink r:id="rId14" w:history="1">
+      <w:hyperlink r:id="rId20" w:history="1">
         <w:r>
           <w:rPr>
             <w:sz w:val="28"/>
             <w:szCs w:val="28"/>
           </w:rPr>
-          <w:t>https://developer.mozilla.org/en</w:t>
-        </w:r>
-        <w:r>
-          <w:rPr>
-            <w:sz w:val="28"/>
-            <w:szCs w:val="28"/>
-          </w:rPr>
-          <w:t>-</w:t>
-        </w:r>
-        <w:r>
-          <w:rPr>
-            <w:sz w:val="28"/>
-            <w:szCs w:val="28"/>
-          </w:rPr>
-          <w:t>US/docs/Web/HTML/Reference/Global_attributes/data-*</w:t>
+          <w:t>https://developer.mozilla.org/en-US/docs/Web/HTML/Reference/Global_attributes/data-*</w:t>
         </w:r>
       </w:hyperlink>
       <w:r>
@@ -2010,7 +3599,23 @@
           <w:sz w:val="28"/>
           <w:szCs w:val="28"/>
         </w:rPr>
-        <w:t>[8]Chart.js. “</w:t>
+        <w:t>[</w:t>
+      </w:r>
+      <w:proofErr w:type="gramStart"/>
+      <w:r>
+        <w:rPr>
+          <w:sz w:val="28"/>
+          <w:szCs w:val="28"/>
+        </w:rPr>
+        <w:t>8]Chart.js</w:t>
+      </w:r>
+      <w:proofErr w:type="gramEnd"/>
+      <w:r>
+        <w:rPr>
+          <w:sz w:val="28"/>
+          <w:szCs w:val="28"/>
+        </w:rPr>
+        <w:t>. “</w:t>
       </w:r>
       <w:r>
         <w:rPr>
@@ -2019,7 +3624,7 @@
         </w:rPr>
         <w:t xml:space="preserve">Getting Started”. Internet: </w:t>
       </w:r>
-      <w:hyperlink r:id="rId15" w:history="1">
+      <w:hyperlink r:id="rId21" w:history="1">
         <w:r>
           <w:rPr>
             <w:sz w:val="28"/>
@@ -2052,7 +3657,163 @@
     </w:p>
     <w:p>
       <w:pPr>
+        <w:spacing w:after="0" w:line="240" w:lineRule="auto"/>
+        <w:rPr>
+          <w:sz w:val="28"/>
+          <w:szCs w:val="28"/>
+        </w:rPr>
+      </w:pPr>
+      <w:r>
+        <w:rPr>
+          <w:sz w:val="28"/>
+          <w:szCs w:val="28"/>
+        </w:rPr>
+        <w:t>[9]</w:t>
+      </w:r>
+      <w:hyperlink r:id="rId22" w:history="1">
+        <w:r>
+          <w:rPr>
+            <w:sz w:val="28"/>
+            <w:szCs w:val="28"/>
+          </w:rPr>
+          <w:t>Divine Hycenth</w:t>
+        </w:r>
+      </w:hyperlink>
+      <w:r>
+        <w:rPr>
+          <w:sz w:val="28"/>
+          <w:szCs w:val="28"/>
+        </w:rPr>
+        <w:t>. “</w:t>
+      </w:r>
+      <w:r>
+        <w:rPr>
+          <w:sz w:val="28"/>
+          <w:szCs w:val="28"/>
+        </w:rPr>
+        <w:t>Convert a Base64 data into an Image in Node.js</w:t>
+      </w:r>
+      <w:r>
+        <w:rPr>
+          <w:sz w:val="28"/>
+          <w:szCs w:val="28"/>
+        </w:rPr>
+        <w:t xml:space="preserve">”. Internet: </w:t>
+      </w:r>
+    </w:p>
+    <w:p>
+      <w:pPr>
         <w:spacing w:line="240" w:lineRule="auto"/>
+        <w:rPr>
+          <w:sz w:val="28"/>
+          <w:szCs w:val="28"/>
+        </w:rPr>
+      </w:pPr>
+      <w:hyperlink r:id="rId23" w:history="1">
+        <w:r>
+          <w:rPr>
+            <w:sz w:val="28"/>
+            <w:szCs w:val="28"/>
+          </w:rPr>
+          <w:t>https://dev.to/dnature/convert-a-base64-data-into-an-image-in-node-js-3f88</w:t>
+        </w:r>
+      </w:hyperlink>
+      <w:r>
+        <w:rPr>
+          <w:sz w:val="28"/>
+          <w:szCs w:val="28"/>
+        </w:rPr>
+        <w:t>, 2020 [Accessed March 7th]</w:t>
+      </w:r>
+      <w:r>
+        <w:rPr>
+          <w:sz w:val="28"/>
+          <w:szCs w:val="28"/>
+        </w:rPr>
+        <w:t>.</w:t>
+      </w:r>
+    </w:p>
+    <w:p>
+      <w:pPr>
+        <w:spacing w:after="0" w:line="240" w:lineRule="auto"/>
+        <w:rPr>
+          <w:sz w:val="28"/>
+          <w:szCs w:val="28"/>
+        </w:rPr>
+      </w:pPr>
+      <w:r>
+        <w:rPr>
+          <w:sz w:val="28"/>
+          <w:szCs w:val="28"/>
+        </w:rPr>
+        <w:t>[</w:t>
+      </w:r>
+      <w:proofErr w:type="gramStart"/>
+      <w:r>
+        <w:rPr>
+          <w:sz w:val="28"/>
+          <w:szCs w:val="28"/>
+        </w:rPr>
+        <w:t>10]CanAdapt</w:t>
+      </w:r>
+      <w:proofErr w:type="gramEnd"/>
+      <w:r>
+        <w:rPr>
+          <w:sz w:val="28"/>
+          <w:szCs w:val="28"/>
+        </w:rPr>
+        <w:t>. “</w:t>
+      </w:r>
+      <w:r>
+        <w:rPr>
+          <w:sz w:val="28"/>
+          <w:szCs w:val="28"/>
+        </w:rPr>
+        <w:t>What happens with aria-labelledby, aria-label and aria-describedby</w:t>
+      </w:r>
+      <w:r>
+        <w:rPr>
+          <w:sz w:val="28"/>
+          <w:szCs w:val="28"/>
+        </w:rPr>
+        <w:t xml:space="preserve">”. Internet: </w:t>
+      </w:r>
+      <w:hyperlink r:id="rId24" w:history="1">
+        <w:r>
+          <w:rPr>
+            <w:rStyle w:val="Hyperlink"/>
+            <w:sz w:val="28"/>
+            <w:szCs w:val="28"/>
+          </w:rPr>
+          <w:t>https://www.davidmacd.com/blog/does-aria-label-override-static-text.html</w:t>
+        </w:r>
+      </w:hyperlink>
+      <w:r>
+        <w:rPr>
+          <w:sz w:val="28"/>
+          <w:szCs w:val="28"/>
+        </w:rPr>
+        <w:t>, [Accessed March 7</w:t>
+      </w:r>
+      <w:r>
+        <w:rPr>
+          <w:sz w:val="28"/>
+          <w:szCs w:val="28"/>
+          <w:vertAlign w:val="superscript"/>
+        </w:rPr>
+        <w:t>th</w:t>
+      </w:r>
+      <w:r>
+        <w:rPr>
+          <w:sz w:val="28"/>
+          <w:szCs w:val="28"/>
+        </w:rPr>
+        <w:t>].</w:t>
+      </w:r>
+    </w:p>
+    <w:p>
+      <w:pPr>
+        <w:spacing w:after="0" w:line="240" w:lineRule="auto"/>
         <w:rPr>
           <w:sz w:val="28"/>
           <w:szCs w:val="28"/>
@@ -2786,6 +4547,7 @@
   <w:style w:type="paragraph" w:default="1" w:styleId="Normal">
     <w:name w:val="Normal"/>
     <w:qFormat/>
+    <w:rsid w:val="00BB40D8"/>
   </w:style>
   <w:style w:type="paragraph" w:styleId="Heading1">
     <w:name w:val="heading 1"/>
@@ -2989,6 +4751,7 @@
   <w:style w:type="character" w:default="1" w:styleId="DefaultParagraphFont">
     <w:name w:val="Default Paragraph Font"/>
     <w:uiPriority w:val="1"/>
+    <w:semiHidden/>
     <w:unhideWhenUsed/>
   </w:style>
   <w:style w:type="table" w:default="1" w:styleId="TableNormal">

</xml_diff>